<commit_message>
fix(doc): refresh FERN manual for premium breath — 1.625 / tight tracking / calm 500
- .ai/AGENT_MANUAL.md: Token Lock tables lh-body 1.5→1.625, tracking -0.01/-0.02→-0.03/-0.075
- bin/build_docx.py: Normal 1.5→1.625, H1-H3 bold→medium (calm, not shouting)
- rebuild DOC/AGENT_MANUAL.docx so https://github.com/paglaai/pagladesign/raw/main/DOC/AGENT_MANUAL.docx matches new tokens
</commit_message>
<xml_diff>
--- a/DOC/AGENT_MANUAL.docx
+++ b/DOC/AGENT_MANUAL.docx
@@ -1817,7 +1817,7 @@
                 <w:color w:val="6B7EFF"/>
                 <w:sz w:val="20"/>
               </w:rPr>
-              <w:t>1.5</w:t>
+              <w:t>1.625</w:t>
             </w:r>
           </w:p>
         </w:tc>
@@ -1998,7 +1998,7 @@
                 <w:color w:val="6B7EFF"/>
                 <w:sz w:val="20"/>
               </w:rPr>
-              <w:t>-0.01em</w:t>
+              <w:t>-0.03em</w:t>
             </w:r>
           </w:p>
         </w:tc>
@@ -2032,7 +2032,7 @@
                 <w:color w:val="6B7EFF"/>
                 <w:sz w:val="20"/>
               </w:rPr>
-              <w:t>-0.02em</w:t>
+              <w:t>-0.075em</w:t>
             </w:r>
           </w:p>
         </w:tc>
@@ -7504,7 +7504,7 @@
     <w:qFormat/>
     <w:rsid w:val="00FC693F"/>
     <w:pPr>
-      <w:spacing w:after="160" w:line="360" w:lineRule="auto"/>
+      <w:spacing w:after="160" w:line="390" w:lineRule="auto"/>
     </w:pPr>
     <w:rPr>
       <w:rFonts w:ascii="Pagla Sans" w:hAnsi="Pagla Sans"/>
@@ -7572,7 +7572,7 @@
     </w:pPr>
     <w:rPr>
       <w:rFonts w:asciiTheme="majorHAnsi" w:eastAsiaTheme="majorEastAsia" w:hAnsiTheme="majorHAnsi" w:cstheme="majorBidi" w:ascii="Pagla Sans" w:hAnsi="Pagla Sans"/>
-      <w:b/>
+      <w:b w:val="0"/>
       <w:bCs/>
       <w:color w:val="0A0A0B"/>
       <w:sz w:val="56"/>
@@ -7596,7 +7596,7 @@
     </w:pPr>
     <w:rPr>
       <w:rFonts w:asciiTheme="majorHAnsi" w:eastAsiaTheme="majorEastAsia" w:hAnsiTheme="majorHAnsi" w:cstheme="majorBidi" w:ascii="Pagla Sans" w:hAnsi="Pagla Sans"/>
-      <w:b/>
+      <w:b w:val="0"/>
       <w:bCs/>
       <w:color w:val="6B7EFF"/>
       <w:sz w:val="40"/>
@@ -7620,7 +7620,7 @@
     </w:pPr>
     <w:rPr>
       <w:rFonts w:asciiTheme="majorHAnsi" w:eastAsiaTheme="majorEastAsia" w:hAnsiTheme="majorHAnsi" w:cstheme="majorBidi" w:ascii="Pagla Sans" w:hAnsi="Pagla Sans"/>
-      <w:b/>
+      <w:b w:val="0"/>
       <w:bCs/>
       <w:color w:val="0A0A0B"/>
       <w:sz w:val="28"/>

</xml_diff>